<commit_message>
-connection string validation -back navigation flicker and owin signout fixed
</commit_message>
<xml_diff>
--- a/Bank Configuration Portal Deployment Manual.docx
+++ b/Bank Configuration Portal Deployment Manual.docx
@@ -638,7 +638,6 @@
         </w:rPr>
         <w:t xml:space="preserve"> Catalog=;Integrated Security=</w:t>
       </w:r>
-      <w:proofErr w:type="spellStart"/>
       <w:r>
         <w:rPr>
           <w:sz w:val="24"/>
@@ -651,15 +650,7 @@
           <w:sz w:val="24"/>
           <w:szCs w:val="24"/>
         </w:rPr>
-        <w:t>;Current</w:t>
-      </w:r>
-      <w:proofErr w:type="spellEnd"/>
-      <w:r>
-        <w:rPr>
-          <w:sz w:val="24"/>
-          <w:szCs w:val="24"/>
-        </w:rPr>
-        <w:t xml:space="preserve"> Language=English;</w:t>
+        <w:t>;</w:t>
       </w:r>
       <w:r>
         <w:rPr>
@@ -780,23 +771,7 @@
           <w:sz w:val="24"/>
           <w:szCs w:val="24"/>
         </w:rPr>
-        <w:t>Data Source</w:t>
-      </w:r>
-      <w:proofErr w:type="gramStart"/>
-      <w:r>
-        <w:rPr>
-          <w:sz w:val="24"/>
-          <w:szCs w:val="24"/>
-        </w:rPr>
-        <w:t>=;Initial</w:t>
-      </w:r>
-      <w:proofErr w:type="gramEnd"/>
-      <w:r>
-        <w:rPr>
-          <w:sz w:val="24"/>
-          <w:szCs w:val="24"/>
-        </w:rPr>
-        <w:t xml:space="preserve"> Catalog=;</w:t>
+        <w:t>Data Source=;Initial Catalog=;</w:t>
       </w:r>
       <w:r>
         <w:rPr>
@@ -805,13 +780,8 @@
         </w:rPr>
         <w:t>User Id=;Password=;</w:t>
       </w:r>
-      <w:r>
-        <w:rPr>
-          <w:sz w:val="24"/>
-          <w:szCs w:val="24"/>
-        </w:rPr>
-        <w:t>Current Language=English;</w:t>
-      </w:r>
+      <w:bookmarkStart w:id="0" w:name="_GoBack"/>
+      <w:bookmarkEnd w:id="0"/>
       <w:r>
         <w:rPr>
           <w:sz w:val="24"/>
@@ -2117,8 +2087,6 @@
         <w:pStyle w:val="ListParagraph"/>
         <w:ind w:left="1080"/>
       </w:pPr>
-      <w:bookmarkStart w:id="0" w:name="_GoBack"/>
-      <w:bookmarkEnd w:id="0"/>
     </w:p>
     <w:p>
       <w:pPr>

</xml_diff>